<commit_message>
fix: align requirements doc and model with the fixed-point interface
Update Model/Requirements.docx (source of truth) and its
doc/Requirements.pdf export to document the fixed-point interface and
calibration names, refresh HEV_powersplit_adapted.slx, and remove the
stale generated model overview/demo HTML.

Co-Authored-By: Claude Opus 4.8 <noreply@anthropic.com>
</commit_message>
<xml_diff>
--- a/Model/Requirements.docx
+++ b/Model/Requirements.docx
@@ -7255,10 +7255,7 @@
         </w:rPr>
       </w:pPr>
       <w:r>
-        <w:rPr>
-          <w:lang w:val="en-US"/>
-        </w:rPr>
-        <w:t>The transition guards evaluate vehicle speed [km/h], requested power [kW], battery state of charge [-], and engine speed [rpm] against the named calibration constants summarized below. The compact aliases used in the transition tables correspond to the model signals speed, P_dem, SOC/charge, and wEng/engine_speed. The numerical values used for these calibrations were chosen by the project team to match the operating envelope of the source model; the upper bound of the EV speed window (SPEED_EV_MAX) is supported by reference [1] in Section 8.</w:t>
+        <w:t>The transition guards evaluate the physical model signals vehicle speed [km/h], requested power [kW], battery state of charge [-], and engine speed [rpm]. The production C API represents the same signals with fixed-point integer fields: speed_dkph [0.1 km/h], p_dem_dkw [0.1 kW], soc_q10000 [0..10000], and weng_rpm [rpm]. The named calibration constants below keep the same physical thresholds used by the model.</w:t>
       </w:r>
     </w:p>
     <w:tbl>
@@ -7343,7 +7340,7 @@
           </w:tcPr>
           <w:p>
             <w:r>
-              <w:t>ENG_ON</w:t>
+              <w:t>ENG_ON_RPM</w:t>
             </w:r>
           </w:p>
         </w:tc>
@@ -7364,16 +7361,8 @@
             <w:vAlign w:val="center"/>
           </w:tcPr>
           <w:p>
-            <w:pPr>
-              <w:rPr>
-                <w:lang w:val="en-US"/>
-              </w:rPr>
-            </w:pPr>
-            <w:r>
-              <w:rPr>
-                <w:lang w:val="en-US"/>
-              </w:rPr>
-              <w:t>Engine-on threshold used by Motion_mode_ICE exits and by Start_mode transitions to ICE_mode or Hybrid_mode.</w:t>
+            <w:r>
+              <w:t>Engine-on threshold used to allow transitions out of Start_mode and common Motion_mode_ICE exits.</w:t>
             </w:r>
           </w:p>
         </w:tc>
@@ -7389,7 +7378,7 @@
           </w:tcPr>
           <w:p>
             <w:r>
-              <w:t>ENG_OFF</w:t>
+              <w:t>ENG_OFF_RPM</w:t>
             </w:r>
           </w:p>
         </w:tc>
@@ -7410,16 +7399,8 @@
             <w:vAlign w:val="center"/>
           </w:tcPr>
           <w:p>
-            <w:pPr>
-              <w:rPr>
-                <w:lang w:val="en-US"/>
-              </w:rPr>
-            </w:pPr>
-            <w:r>
-              <w:rPr>
-                <w:lang w:val="en-US"/>
-              </w:rPr>
-              <w:t>Engine-off threshold used by ICE_mode and Hybrid_mode returns to Start_mode.</w:t>
+            <w:r>
+              <w:t>Engine-off threshold used to reset ICE_mode or Hybrid_mode back to Start_mode.</w:t>
             </w:r>
           </w:p>
         </w:tc>
@@ -7435,7 +7416,7 @@
           </w:tcPr>
           <w:p>
             <w:r>
-              <w:t>SPEED_STOP</w:t>
+              <w:t>SPEED_STOP_DKPH</w:t>
             </w:r>
           </w:p>
         </w:tc>
@@ -7446,7 +7427,7 @@
           </w:tcPr>
           <w:p>
             <w:r>
-              <w:t>0.5 km/h</w:t>
+              <w:t>5 (0.5 km/h)</w:t>
             </w:r>
           </w:p>
         </w:tc>
@@ -7456,15 +7437,7 @@
             <w:vAlign w:val="center"/>
           </w:tcPr>
           <w:p>
-            <w:pPr>
-              <w:rPr>
-                <w:lang w:val="en-US"/>
-              </w:rPr>
-            </w:pPr>
-            <w:r>
-              <w:rPr>
-                <w:lang w:val="en-US"/>
-              </w:rPr>
+            <w:r>
               <w:t>Standstill threshold used by returns to StandStill.</w:t>
             </w:r>
           </w:p>
@@ -7481,7 +7454,7 @@
           </w:tcPr>
           <w:p>
             <w:r>
-              <w:t>SPEED_REGEN</w:t>
+              <w:t>SPEED_REGEN_DKPH</w:t>
             </w:r>
           </w:p>
         </w:tc>
@@ -7492,7 +7465,7 @@
           </w:tcPr>
           <w:p>
             <w:r>
-              <w:t>5 km/h</w:t>
+              <w:t>50 (5.0 km/h)</w:t>
             </w:r>
           </w:p>
         </w:tc>
@@ -7502,15 +7475,7 @@
             <w:vAlign w:val="center"/>
           </w:tcPr>
           <w:p>
-            <w:pPr>
-              <w:rPr>
-                <w:lang w:val="en-US"/>
-              </w:rPr>
-            </w:pPr>
-            <w:r>
-              <w:rPr>
-                <w:lang w:val="en-US"/>
-              </w:rPr>
+            <w:r>
               <w:t>Minimum speed threshold used for entry into RegenB_mode.</w:t>
             </w:r>
           </w:p>
@@ -7527,7 +7492,7 @@
           </w:tcPr>
           <w:p>
             <w:r>
-              <w:t>SPEED_EV_MAX</w:t>
+              <w:t>SPEED_EV_MAX_DKPH</w:t>
             </w:r>
           </w:p>
         </w:tc>
@@ -7538,7 +7503,7 @@
           </w:tcPr>
           <w:p>
             <w:r>
-              <w:t>35 km/h</w:t>
+              <w:t>350 (35.0 km/h)</w:t>
             </w:r>
           </w:p>
         </w:tc>
@@ -7548,15 +7513,7 @@
             <w:vAlign w:val="center"/>
           </w:tcPr>
           <w:p>
-            <w:pPr>
-              <w:rPr>
-                <w:lang w:val="en-US"/>
-              </w:rPr>
-            </w:pPr>
-            <w:r>
-              <w:rPr>
-                <w:lang w:val="en-US"/>
-              </w:rPr>
+            <w:r>
               <w:t>Upper speed limit of the EV operating window and a boundary for engine-supported motion [1].</w:t>
             </w:r>
           </w:p>
@@ -7573,7 +7530,7 @@
           </w:tcPr>
           <w:p>
             <w:r>
-              <w:t>PDEM_REGEN</w:t>
+              <w:t>PDEM_REGEN_DKW</w:t>
             </w:r>
           </w:p>
         </w:tc>
@@ -7584,7 +7541,7 @@
           </w:tcPr>
           <w:p>
             <w:r>
-              <w:t>-5 kW</w:t>
+              <w:t>-50 (-5.0 kW)</w:t>
             </w:r>
           </w:p>
         </w:tc>
@@ -7594,15 +7551,7 @@
             <w:vAlign w:val="center"/>
           </w:tcPr>
           <w:p>
-            <w:pPr>
-              <w:rPr>
-                <w:lang w:val="en-US"/>
-              </w:rPr>
-            </w:pPr>
-            <w:r>
-              <w:rPr>
-                <w:lang w:val="en-US"/>
-              </w:rPr>
+            <w:r>
               <w:t>Requested-power threshold that admits regenerative braking operation.</w:t>
             </w:r>
           </w:p>
@@ -7619,7 +7568,7 @@
           </w:tcPr>
           <w:p>
             <w:r>
-              <w:t>PDEM_STOP_LOW</w:t>
+              <w:t>PDEM_STOP_LOW_DKW</w:t>
             </w:r>
           </w:p>
         </w:tc>
@@ -7630,7 +7579,7 @@
           </w:tcPr>
           <w:p>
             <w:r>
-              <w:t>-1 kW</w:t>
+              <w:t>-10 (-1.0 kW)</w:t>
             </w:r>
           </w:p>
         </w:tc>
@@ -7640,15 +7589,7 @@
             <w:vAlign w:val="center"/>
           </w:tcPr>
           <w:p>
-            <w:pPr>
-              <w:rPr>
-                <w:lang w:val="en-US"/>
-              </w:rPr>
-            </w:pPr>
-            <w:r>
-              <w:rPr>
-                <w:lang w:val="en-US"/>
-              </w:rPr>
+            <w:r>
               <w:t>Lower bound of the neutral stop-demand window used by returns to StandStill.</w:t>
             </w:r>
           </w:p>
@@ -7665,7 +7606,7 @@
           </w:tcPr>
           <w:p>
             <w:r>
-              <w:t>PDEM_STOP_HIGH</w:t>
+              <w:t>PDEM_STOP_HIGH_DKW</w:t>
             </w:r>
           </w:p>
         </w:tc>
@@ -7676,7 +7617,7 @@
           </w:tcPr>
           <w:p>
             <w:r>
-              <w:t>1 kW</w:t>
+              <w:t>10 (1.0 kW)</w:t>
             </w:r>
           </w:p>
         </w:tc>
@@ -7686,15 +7627,7 @@
             <w:vAlign w:val="center"/>
           </w:tcPr>
           <w:p>
-            <w:pPr>
-              <w:rPr>
-                <w:lang w:val="en-US"/>
-              </w:rPr>
-            </w:pPr>
-            <w:r>
-              <w:rPr>
-                <w:lang w:val="en-US"/>
-              </w:rPr>
+            <w:r>
               <w:t>Upper bound of the neutral stop-demand window used by returns to StandStill.</w:t>
             </w:r>
           </w:p>
@@ -7711,7 +7644,7 @@
           </w:tcPr>
           <w:p>
             <w:r>
-              <w:t>PDEM_HYB_IN</w:t>
+              <w:t>PDEM_HYB_IN_DKW</w:t>
             </w:r>
           </w:p>
         </w:tc>
@@ -7722,7 +7655,7 @@
           </w:tcPr>
           <w:p>
             <w:r>
-              <w:t>50 kW</w:t>
+              <w:t>500 (50.0 kW)</w:t>
             </w:r>
           </w:p>
         </w:tc>
@@ -7732,15 +7665,7 @@
             <w:vAlign w:val="center"/>
           </w:tcPr>
           <w:p>
-            <w:pPr>
-              <w:rPr>
-                <w:lang w:val="en-US"/>
-              </w:rPr>
-            </w:pPr>
-            <w:r>
-              <w:rPr>
-                <w:lang w:val="en-US"/>
-              </w:rPr>
+            <w:r>
               <w:t>Requested-power threshold that forces EV_mode to leave for Motion_mode_ICE.</w:t>
             </w:r>
           </w:p>
@@ -7757,7 +7682,7 @@
           </w:tcPr>
           <w:p>
             <w:r>
-              <w:t>PDEM_HYB_OUT</w:t>
+              <w:t>PDEM_HYB_OUT_DKW</w:t>
             </w:r>
           </w:p>
         </w:tc>
@@ -7768,7 +7693,7 @@
           </w:tcPr>
           <w:p>
             <w:r>
-              <w:t>40 kW</w:t>
+              <w:t>400 (40.0 kW)</w:t>
             </w:r>
           </w:p>
         </w:tc>
@@ -7778,15 +7703,7 @@
             <w:vAlign w:val="center"/>
           </w:tcPr>
           <w:p>
-            <w:pPr>
-              <w:rPr>
-                <w:lang w:val="en-US"/>
-              </w:rPr>
-            </w:pPr>
-            <w:r>
-              <w:rPr>
-                <w:lang w:val="en-US"/>
-              </w:rPr>
+            <w:r>
               <w:t>Requested-power limit that allows Motion_mode_ICE to return to EV_mode.</w:t>
             </w:r>
           </w:p>
@@ -7803,8 +7720,7 @@
           </w:tcPr>
           <w:p>
             <w:r>
-              <w:lastRenderedPageBreak/>
-              <w:t>PDEM_HYB_MID</w:t>
+              <w:t>PDEM_HYB_MID_DKW</w:t>
             </w:r>
           </w:p>
         </w:tc>
@@ -7815,7 +7731,7 @@
           </w:tcPr>
           <w:p>
             <w:r>
-              <w:t>15 kW</w:t>
+              <w:t>150 (15.0 kW)</w:t>
             </w:r>
           </w:p>
         </w:tc>
@@ -7825,15 +7741,7 @@
             <w:vAlign w:val="center"/>
           </w:tcPr>
           <w:p>
-            <w:pPr>
-              <w:rPr>
-                <w:lang w:val="en-US"/>
-              </w:rPr>
-            </w:pPr>
-            <w:r>
-              <w:rPr>
-                <w:lang w:val="en-US"/>
-              </w:rPr>
+            <w:r>
               <w:t>Requested-power threshold used by Start_mode and ICE_mode transitions into Hybrid_mode.</w:t>
             </w:r>
           </w:p>
@@ -7850,7 +7758,7 @@
           </w:tcPr>
           <w:p>
             <w:r>
-              <w:t>PDEM_HYB_LOW</w:t>
+              <w:t>PDEM_HYB_LOW_DKW</w:t>
             </w:r>
           </w:p>
         </w:tc>
@@ -7861,7 +7769,7 @@
           </w:tcPr>
           <w:p>
             <w:r>
-              <w:t>10 kW</w:t>
+              <w:t>100 (10.0 kW)</w:t>
             </w:r>
           </w:p>
         </w:tc>
@@ -7871,15 +7779,7 @@
             <w:vAlign w:val="center"/>
           </w:tcPr>
           <w:p>
-            <w:pPr>
-              <w:rPr>
-                <w:lang w:val="en-US"/>
-              </w:rPr>
-            </w:pPr>
-            <w:r>
-              <w:rPr>
-                <w:lang w:val="en-US"/>
-              </w:rPr>
+            <w:r>
               <w:t>Requested-power threshold used by Hybrid_mode transition back to ICE_mode.</w:t>
             </w:r>
           </w:p>
@@ -7896,7 +7796,7 @@
           </w:tcPr>
           <w:p>
             <w:r>
-              <w:t>SOC_EV_IN</w:t>
+              <w:t>SOC_EV_IN_Q10000</w:t>
             </w:r>
           </w:p>
         </w:tc>
@@ -7907,7 +7807,7 @@
           </w:tcPr>
           <w:p>
             <w:r>
-              <w:t>0.37 [-]</w:t>
+              <w:t>3700 (0.37)</w:t>
             </w:r>
           </w:p>
         </w:tc>
@@ -7917,15 +7817,7 @@
             <w:vAlign w:val="center"/>
           </w:tcPr>
           <w:p>
-            <w:pPr>
-              <w:rPr>
-                <w:lang w:val="en-US"/>
-              </w:rPr>
-            </w:pPr>
-            <w:r>
-              <w:rPr>
-                <w:lang w:val="en-US"/>
-              </w:rPr>
+            <w:r>
               <w:t>State-of-charge threshold that admits EV_mode.</w:t>
             </w:r>
           </w:p>
@@ -7942,7 +7834,7 @@
           </w:tcPr>
           <w:p>
             <w:r>
-              <w:t>SOC_EV_OUT</w:t>
+              <w:t>SOC_EV_OUT_Q10000</w:t>
             </w:r>
           </w:p>
         </w:tc>
@@ -7953,7 +7845,7 @@
           </w:tcPr>
           <w:p>
             <w:r>
-              <w:t>0.35 [-]</w:t>
+              <w:t>3500 (0.35)</w:t>
             </w:r>
           </w:p>
         </w:tc>
@@ -7963,15 +7855,7 @@
             <w:vAlign w:val="center"/>
           </w:tcPr>
           <w:p>
-            <w:pPr>
-              <w:rPr>
-                <w:lang w:val="en-US"/>
-              </w:rPr>
-            </w:pPr>
-            <w:r>
-              <w:rPr>
-                <w:lang w:val="en-US"/>
-              </w:rPr>
+            <w:r>
               <w:t>State-of-charge threshold that closes the EV window and provides SOC hysteresis.</w:t>
             </w:r>
           </w:p>
@@ -7988,7 +7872,7 @@
           </w:tcPr>
           <w:p>
             <w:r>
-              <w:t>SOC_MID</w:t>
+              <w:t>SOC_MID_Q10000</w:t>
             </w:r>
           </w:p>
         </w:tc>
@@ -7999,7 +7883,7 @@
           </w:tcPr>
           <w:p>
             <w:r>
-              <w:t>0.30 [-]</w:t>
+              <w:t>3000 (0.30)</w:t>
             </w:r>
           </w:p>
         </w:tc>
@@ -8009,15 +7893,7 @@
             <w:vAlign w:val="center"/>
           </w:tcPr>
           <w:p>
-            <w:pPr>
-              <w:rPr>
-                <w:lang w:val="en-US"/>
-              </w:rPr>
-            </w:pPr>
-            <w:r>
-              <w:rPr>
-                <w:lang w:val="en-US"/>
-              </w:rPr>
+            <w:r>
               <w:t>State-of-charge split used by Start_mode and ICE_mode versus Hybrid_mode decisions.</w:t>
             </w:r>
           </w:p>
@@ -8034,7 +7910,7 @@
           </w:tcPr>
           <w:p>
             <w:r>
-              <w:t>SOC_LOW</w:t>
+              <w:t>SOC_LOW_Q10000</w:t>
             </w:r>
           </w:p>
         </w:tc>
@@ -8045,7 +7921,7 @@
           </w:tcPr>
           <w:p>
             <w:r>
-              <w:t>0.25 [-]</w:t>
+              <w:t>2500 (0.25)</w:t>
             </w:r>
           </w:p>
         </w:tc>
@@ -8055,15 +7931,7 @@
             <w:vAlign w:val="center"/>
           </w:tcPr>
           <w:p>
-            <w:pPr>
-              <w:rPr>
-                <w:lang w:val="en-US"/>
-              </w:rPr>
-            </w:pPr>
-            <w:r>
-              <w:rPr>
-                <w:lang w:val="en-US"/>
-              </w:rPr>
+            <w:r>
               <w:t>Low state-of-charge threshold that forces Hybrid_mode back to ICE_mode.</w:t>
             </w:r>
           </w:p>
@@ -8191,17 +8059,7 @@
         </w:rPr>
       </w:pPr>
       <w:r>
-        <w:rPr>
-          <w:lang w:val="en-US"/>
-        </w:rPr>
-        <w:t xml:space="preserve">The transition identifiers T1 to T17 follow the evaluation ordering used in the extracted Stateflow transition map for each source state. Unless noted otherwise, the transition conditions </w:t>
-      </w:r>
-      <w:r>
-        <w:rPr>
-          <w:lang w:val="en-US"/>
-        </w:rPr>
-        <w:lastRenderedPageBreak/>
-        <w:t>below use the compact model aliases speed [km/h], P_dem [kW], SOC = battery state of charge [-], and wEng = engine speed [rpm].</w:t>
+        <w:t>The transition identifiers T1 to T17 follow the Stateflow transition ordering for each source state. The transition tables below use the fixed-point C field and calibration names; they are equivalent to the physical model guards after applying the documented scale factors.</w:t>
       </w:r>
     </w:p>
     <w:p>
@@ -8358,16 +8216,8 @@
             <w:vAlign w:val="center"/>
           </w:tcPr>
           <w:p>
-            <w:pPr>
-              <w:rPr>
-                <w:lang w:val="en-US"/>
-              </w:rPr>
-            </w:pPr>
-            <w:r>
-              <w:rPr>
-                <w:lang w:val="en-US"/>
-              </w:rPr>
-              <w:t>speed &gt; SPEED_STOP &amp;&amp; speed &lt;= SPEED_EV_MAX &amp;&amp; SOC &gt;= SOC_EV_IN</w:t>
+            <w:r>
+              <w:t>speed_dkph &gt; SPEED_STOP_DKPH &amp;&amp; speed_dkph &lt;= SPEED_EV_MAX_DKPH &amp;&amp; soc_q10000 &gt;= SOC_EV_IN_Q10000</w:t>
             </w:r>
           </w:p>
         </w:tc>
@@ -8415,16 +8265,8 @@
             <w:vAlign w:val="center"/>
           </w:tcPr>
           <w:p>
-            <w:pPr>
-              <w:rPr>
-                <w:lang w:val="en-US"/>
-              </w:rPr>
-            </w:pPr>
-            <w:r>
-              <w:rPr>
-                <w:lang w:val="en-US"/>
-              </w:rPr>
-              <w:t>speed &gt; SPEED_STOP &amp;&amp; (speed &gt; SPEED_EV_MAX || SOC &lt; SOC_EV_IN)</w:t>
+            <w:r>
+              <w:t>speed_dkph &gt; SPEED_STOP_DKPH</w:t>
             </w:r>
           </w:p>
         </w:tc>
@@ -8472,16 +8314,8 @@
             <w:vAlign w:val="center"/>
           </w:tcPr>
           <w:p>
-            <w:pPr>
-              <w:rPr>
-                <w:lang w:val="en-US"/>
-              </w:rPr>
-            </w:pPr>
-            <w:r>
-              <w:rPr>
-                <w:lang w:val="en-US"/>
-              </w:rPr>
-              <w:t>speed &gt; SPEED_REGEN &amp;&amp; P_dem &lt;= PDEM_REGEN</w:t>
+            <w:r>
+              <w:t>speed_dkph &gt; SPEED_REGEN_DKPH &amp;&amp; p_dem_dkw &lt;= PDEM_REGEN_DKW</w:t>
             </w:r>
           </w:p>
         </w:tc>
@@ -8529,16 +8363,8 @@
             <w:vAlign w:val="center"/>
           </w:tcPr>
           <w:p>
-            <w:pPr>
-              <w:rPr>
-                <w:lang w:val="en-US"/>
-              </w:rPr>
-            </w:pPr>
-            <w:r>
-              <w:rPr>
-                <w:lang w:val="en-US"/>
-              </w:rPr>
-              <w:t>speed &gt; SPEED_EV_MAX || P_dem &gt;= PDEM_HYB_IN || SOC &lt; SOC_EV_OUT</w:t>
+            <w:r>
+              <w:t>speed_dkph &gt; SPEED_EV_MAX_DKPH || p_dem_dkw &gt;= PDEM_HYB_IN_DKW || soc_q10000 &lt; SOC_EV_OUT_Q10000</w:t>
             </w:r>
           </w:p>
         </w:tc>
@@ -8586,16 +8412,8 @@
             <w:vAlign w:val="center"/>
           </w:tcPr>
           <w:p>
-            <w:pPr>
-              <w:rPr>
-                <w:lang w:val="en-US"/>
-              </w:rPr>
-            </w:pPr>
-            <w:r>
-              <w:rPr>
-                <w:lang w:val="en-US"/>
-              </w:rPr>
-              <w:t>speed &lt;= SPEED_STOP &amp;&amp; P_dem &lt;= PDEM_STOP_HIGH &amp;&amp; P_dem &gt;= PDEM_STOP_LOW</w:t>
+            <w:r>
+              <w:t>speed_dkph &lt;= SPEED_STOP_DKPH &amp;&amp; p_dem_dkw &lt;= PDEM_STOP_HIGH_DKW &amp;&amp; p_dem_dkw &gt;= PDEM_STOP_LOW_DKW</w:t>
             </w:r>
           </w:p>
         </w:tc>
@@ -8643,16 +8461,8 @@
             <w:vAlign w:val="center"/>
           </w:tcPr>
           <w:p>
-            <w:pPr>
-              <w:rPr>
-                <w:lang w:val="en-US"/>
-              </w:rPr>
-            </w:pPr>
-            <w:r>
-              <w:rPr>
-                <w:lang w:val="en-US"/>
-              </w:rPr>
-              <w:t>((speed &gt; SPEED_EV_MAX) &amp;&amp; (P_dem &gt;= PDEM_STOP_LOW)) || SOC &lt; SOC_EV_OUT</w:t>
+            <w:r>
+              <w:t>((speed_dkph &gt; SPEED_EV_MAX_DKPH) &amp; (p_dem_dkw &gt;= PDEM_STOP_LOW_DKW)) | (soc_q10000 &lt; SOC_EV_OUT_Q10000)</w:t>
             </w:r>
           </w:p>
         </w:tc>
@@ -8700,16 +8510,8 @@
             <w:vAlign w:val="center"/>
           </w:tcPr>
           <w:p>
-            <w:pPr>
-              <w:rPr>
-                <w:lang w:val="en-US"/>
-              </w:rPr>
-            </w:pPr>
-            <w:r>
-              <w:rPr>
-                <w:lang w:val="en-US"/>
-              </w:rPr>
-              <w:t>speed &lt;= SPEED_STOP &amp;&amp; P_dem &lt;= PDEM_STOP_HIGH &amp;&amp; P_dem &gt;= PDEM_STOP_LOW</w:t>
+            <w:r>
+              <w:t>speed_dkph &lt;= SPEED_STOP_DKPH &amp;&amp; p_dem_dkw &lt;= PDEM_STOP_HIGH_DKW &amp;&amp; p_dem_dkw &gt;= PDEM_STOP_LOW_DKW</w:t>
             </w:r>
           </w:p>
         </w:tc>
@@ -8757,16 +8559,8 @@
             <w:vAlign w:val="center"/>
           </w:tcPr>
           <w:p>
-            <w:pPr>
-              <w:rPr>
-                <w:lang w:val="en-US"/>
-              </w:rPr>
-            </w:pPr>
-            <w:r>
-              <w:rPr>
-                <w:lang w:val="en-US"/>
-              </w:rPr>
-              <w:t>P_dem &gt;= PDEM_STOP_LOW &amp;&amp; speed &gt; SPEED_STOP &amp;&amp; speed &lt;= SPEED_EV_MAX &amp;&amp; SOC &gt;= SOC_EV_OUT</w:t>
+            <w:r>
+              <w:t>p_dem_dkw &gt;= PDEM_STOP_LOW_DKW &amp;&amp; speed_dkph &gt; SPEED_STOP_DKPH</w:t>
             </w:r>
           </w:p>
         </w:tc>
@@ -8814,16 +8608,8 @@
             <w:vAlign w:val="center"/>
           </w:tcPr>
           <w:p>
-            <w:pPr>
-              <w:rPr>
-                <w:lang w:val="en-US"/>
-              </w:rPr>
-            </w:pPr>
-            <w:r>
-              <w:rPr>
-                <w:lang w:val="en-US"/>
-              </w:rPr>
-              <w:t>wEng &gt; ENG_ON &amp;&amp; speed &gt; SPEED_REGEN &amp;&amp; P_dem &lt;= PDEM_REGEN</w:t>
+            <w:r>
+              <w:t>weng_rpm &gt; ENG_ON_RPM &amp;&amp; speed_dkph &gt; SPEED_REGEN_DKPH &amp;&amp; p_dem_dkw &lt;= PDEM_REGEN_DKW</w:t>
             </w:r>
           </w:p>
         </w:tc>
@@ -8871,16 +8657,8 @@
             <w:vAlign w:val="center"/>
           </w:tcPr>
           <w:p>
-            <w:pPr>
-              <w:rPr>
-                <w:lang w:val="en-US"/>
-              </w:rPr>
-            </w:pPr>
-            <w:r>
-              <w:rPr>
-                <w:lang w:val="en-US"/>
-              </w:rPr>
-              <w:t>wEng &gt; ENG_ON &amp;&amp; P_dem &lt;= PDEM_HYB_OUT &amp;&amp; P_dem &gt;= PDEM_STOP_LOW &amp;&amp; speed &gt; SPEED_STOP &amp;&amp; speed &lt;= SPEED_EV_MAX &amp;&amp; SOC &gt;= SOC_EV_IN</w:t>
+            <w:r>
+              <w:t>weng_rpm &gt; ENG_ON_RPM &amp;&amp; p_dem_dkw &lt;= PDEM_HYB_OUT_DKW &amp;&amp; p_dem_dkw &gt;= PDEM_STOP_LOW_DKW &amp;&amp; speed_dkph &gt; SPEED_STOP_DKPH &amp;&amp; speed_dkph &lt;= SPEED_EV_MAX_DKPH &amp;&amp; soc_q10000 &gt;= SOC_EV_IN_Q10000</w:t>
             </w:r>
           </w:p>
         </w:tc>
@@ -8928,16 +8706,8 @@
             <w:vAlign w:val="center"/>
           </w:tcPr>
           <w:p>
-            <w:pPr>
-              <w:rPr>
-                <w:lang w:val="en-US"/>
-              </w:rPr>
-            </w:pPr>
-            <w:r>
-              <w:rPr>
-                <w:lang w:val="en-US"/>
-              </w:rPr>
-              <w:t>speed &lt;= SPEED_STOP &amp;&amp; P_dem &lt;= PDEM_STOP_HIGH &amp;&amp; P_dem &gt;= PDEM_STOP_LOW</w:t>
+            <w:r>
+              <w:t>speed_dkph &lt;= SPEED_STOP_DKPH &amp;&amp; p_dem_dkw &lt;= PDEM_STOP_HIGH_DKW &amp;&amp; p_dem_dkw &gt;= PDEM_STOP_LOW_DKW</w:t>
             </w:r>
           </w:p>
         </w:tc>
@@ -9092,16 +8862,8 @@
             <w:vAlign w:val="center"/>
           </w:tcPr>
           <w:p>
-            <w:pPr>
-              <w:rPr>
-                <w:lang w:val="en-US"/>
-              </w:rPr>
-            </w:pPr>
-            <w:r>
-              <w:rPr>
-                <w:lang w:val="en-US"/>
-              </w:rPr>
-              <w:t>wEng &gt; ENG_ON &amp;&amp; SOC &gt;= SOC_MID &amp;&amp; (speed &gt; SPEED_EV_MAX || P_dem &gt;= PDEM_HYB_MID)</w:t>
+            <w:r>
+              <w:t>weng_rpm &gt; ENG_ON_RPM &amp;&amp; soc_q10000 &gt;= SOC_MID_Q10000 &amp;&amp; (speed_dkph &gt; SPEED_EV_MAX_DKPH || p_dem_dkw &gt;= PDEM_HYB_MID_DKW)</w:t>
             </w:r>
           </w:p>
         </w:tc>
@@ -9150,16 +8912,8 @@
             <w:vAlign w:val="center"/>
           </w:tcPr>
           <w:p>
-            <w:pPr>
-              <w:rPr>
-                <w:lang w:val="en-US"/>
-              </w:rPr>
-            </w:pPr>
-            <w:r>
-              <w:rPr>
-                <w:lang w:val="en-US"/>
-              </w:rPr>
-              <w:t>wEng &gt; ENG_ON &amp;&amp; (SOC &lt; SOC_MID || (speed &lt;= SPEED_EV_MAX &amp;&amp; P_dem &lt; PDEM_HYB_MID))</w:t>
+            <w:r>
+              <w:t>weng_rpm &gt; ENG_ON_RPM</w:t>
             </w:r>
           </w:p>
         </w:tc>
@@ -9208,7 +8962,7 @@
           </w:tcPr>
           <w:p>
             <w:r>
-              <w:t>wEng &lt;= ENG_OFF</w:t>
+              <w:t>weng_rpm &lt;= ENG_OFF_RPM</w:t>
             </w:r>
           </w:p>
         </w:tc>
@@ -9256,16 +9010,8 @@
             <w:vAlign w:val="center"/>
           </w:tcPr>
           <w:p>
-            <w:pPr>
-              <w:rPr>
-                <w:lang w:val="en-US"/>
-              </w:rPr>
-            </w:pPr>
-            <w:r>
-              <w:rPr>
-                <w:lang w:val="en-US"/>
-              </w:rPr>
-              <w:t>P_dem &gt;= PDEM_HYB_MID &amp;&amp; SOC &gt;= SOC_MID</w:t>
+            <w:r>
+              <w:t>p_dem_dkw &gt;= PDEM_HYB_MID_DKW &amp;&amp; soc_q10000 &gt;= SOC_MID_Q10000</w:t>
             </w:r>
           </w:p>
         </w:tc>
@@ -9314,7 +9060,7 @@
           </w:tcPr>
           <w:p>
             <w:r>
-              <w:t>wEng &lt;= ENG_OFF</w:t>
+              <w:t>weng_rpm &lt;= ENG_OFF_RPM</w:t>
             </w:r>
           </w:p>
         </w:tc>
@@ -9362,16 +9108,8 @@
             <w:vAlign w:val="center"/>
           </w:tcPr>
           <w:p>
-            <w:pPr>
-              <w:rPr>
-                <w:lang w:val="en-US"/>
-              </w:rPr>
-            </w:pPr>
-            <w:r>
-              <w:rPr>
-                <w:lang w:val="en-US"/>
-              </w:rPr>
-              <w:t>P_dem &lt;= PDEM_HYB_LOW || SOC &lt; SOC_LOW</w:t>
+            <w:r>
+              <w:t>p_dem_dkw &lt;= PDEM_HYB_LOW_DKW || soc_q10000 &lt; SOC_LOW_Q10000</w:t>
             </w:r>
           </w:p>
         </w:tc>
@@ -9942,16 +9680,8 @@
             <w:vAlign w:val="center"/>
           </w:tcPr>
           <w:p>
-            <w:pPr>
-              <w:rPr>
-                <w:lang w:val="en-US"/>
-              </w:rPr>
-            </w:pPr>
-            <w:r>
-              <w:rPr>
-                <w:lang w:val="en-US"/>
-              </w:rPr>
-              <w:t>The VMU shall evaluate mode transitions using the named calibrations ENG_ON, ENG_OFF, SPEED_STOP, SPEED_REGEN, SPEED_EV_MAX, PDEM_REGEN, PDEM_STOP_LOW, PDEM_STOP_HIGH, PDEM_HYB_IN, PDEM_HYB_OUT, PDEM_HYB_MID, PDEM_HYB_LOW, SOC_EV_IN, SOC_EV_OUT, SOC_MID, and SOC_LOW while preserving the modeled hysteresis on battery state of charge and engine speed thresholds.</w:t>
+            <w:r>
+              <w:t>The VMU shall evaluate mode transitions using the named fixed-point calibrations ENG_ON_RPM, ENG_OFF_RPM, SPEED_STOP_DKPH, SPEED_REGEN_DKPH, SPEED_EV_MAX_DKPH, PDEM_REGEN_DKW, PDEM_STOP_LOW_DKW, PDEM_STOP_HIGH_DKW, PDEM_HYB_IN_DKW, PDEM_HYB_OUT_DKW, PDEM_HYB_MID_DKW, PDEM_HYB_LOW_DKW, SOC_EV_IN_Q10000, SOC_EV_OUT_Q10000, SOC_MID_Q10000, and SOC_LOW_Q10000 while preserving the modeled hysteresis on battery state of charge and engine speed thresholds.</w:t>
             </w:r>
           </w:p>
         </w:tc>
@@ -12717,16 +12447,8 @@
             <w:vAlign w:val="center"/>
           </w:tcPr>
           <w:p>
-            <w:pPr>
-              <w:rPr>
-                <w:lang w:val="en-US"/>
-              </w:rPr>
-            </w:pPr>
-            <w:r>
-              <w:rPr>
-                <w:lang w:val="en-US"/>
-              </w:rPr>
-              <w:t>When the active software mode is the standstill mode and speed &gt; SPEED_STOP &amp;&amp; speed &lt;= SPEED_EV_MAX &amp;&amp; SOC &gt;= SOC_EV_IN, the software shall transition to EV mode.</w:t>
+            <w:r>
+              <w:t>When the active software mode is the standstill mode and speed_dkph &gt; SPEED_STOP_DKPH &amp;&amp; speed_dkph &lt;= SPEED_EV_MAX_DKPH &amp;&amp; soc_q10000 &gt;= SOC_EV_IN_Q10000, the software shall transition to EV mode.</w:t>
             </w:r>
           </w:p>
         </w:tc>
@@ -12966,16 +12688,8 @@
             <w:vAlign w:val="center"/>
           </w:tcPr>
           <w:p>
-            <w:pPr>
-              <w:rPr>
-                <w:lang w:val="en-US"/>
-              </w:rPr>
-            </w:pPr>
-            <w:r>
-              <w:rPr>
-                <w:lang w:val="en-US"/>
-              </w:rPr>
-              <w:t>When the active software mode is the standstill mode and speed &gt; SPEED_STOP &amp;&amp; (speed &gt; SPEED_EV_MAX || SOC &lt; SOC_EV_IN), the software shall transition to Start mode.</w:t>
+            <w:r>
+              <w:t>When the active software mode is the standstill mode and speed_dkph &gt; SPEED_STOP_DKPH, the software shall transition to Start mode.</w:t>
             </w:r>
           </w:p>
         </w:tc>
@@ -13216,16 +12930,8 @@
             <w:vAlign w:val="center"/>
           </w:tcPr>
           <w:p>
-            <w:pPr>
-              <w:rPr>
-                <w:lang w:val="en-US"/>
-              </w:rPr>
-            </w:pPr>
-            <w:r>
-              <w:rPr>
-                <w:lang w:val="en-US"/>
-              </w:rPr>
-              <w:t>When the active software mode is EV mode and speed &gt; SPEED_REGEN &amp;&amp; P_dem &lt;= PDEM_REGEN, the software shall transition to the regenerative-braking mode.</w:t>
+            <w:r>
+              <w:t>When the active software mode is EV mode and speed_dkph &gt; SPEED_REGEN_DKPH &amp;&amp; p_dem_dkw &lt;= PDEM_REGEN_DKW, the software shall transition to the regenerative-braking mode.</w:t>
             </w:r>
           </w:p>
         </w:tc>
@@ -13465,16 +13171,8 @@
             <w:vAlign w:val="center"/>
           </w:tcPr>
           <w:p>
-            <w:pPr>
-              <w:rPr>
-                <w:lang w:val="en-US"/>
-              </w:rPr>
-            </w:pPr>
-            <w:r>
-              <w:rPr>
-                <w:lang w:val="en-US"/>
-              </w:rPr>
-              <w:t>When the active software mode is EV mode and (speed &gt; SPEED_EV_MAX || P_dem &gt;= PDEM_HYB_IN || SOC &lt; SOC_EV_OUT), the software shall transition to Start mode.</w:t>
+            <w:r>
+              <w:t>When the active software mode is EV mode and (speed_dkph &gt; SPEED_EV_MAX_DKPH || p_dem_dkw &gt;= PDEM_HYB_IN_DKW || soc_q10000 &lt; SOC_EV_OUT_Q10000), the software shall transition to Start mode.</w:t>
             </w:r>
           </w:p>
         </w:tc>
@@ -13714,16 +13412,8 @@
             <w:vAlign w:val="center"/>
           </w:tcPr>
           <w:p>
-            <w:pPr>
-              <w:rPr>
-                <w:lang w:val="en-US"/>
-              </w:rPr>
-            </w:pPr>
-            <w:r>
-              <w:rPr>
-                <w:lang w:val="en-US"/>
-              </w:rPr>
-              <w:t>When the active software mode is EV mode and speed &lt;= SPEED_STOP &amp;&amp; P_dem &lt;= PDEM_STOP_HIGH &amp;&amp; P_dem &gt;= PDEM_STOP_LOW, the software shall transition to the standstill mode.</w:t>
+            <w:r>
+              <w:t>When the active software mode is EV mode and speed_dkph &lt;= SPEED_STOP_DKPH &amp;&amp; p_dem_dkw &lt;= PDEM_STOP_HIGH_DKW &amp;&amp; p_dem_dkw &gt;= PDEM_STOP_LOW_DKW, the software shall transition to the standstill mode.</w:t>
             </w:r>
           </w:p>
         </w:tc>
@@ -13963,16 +13653,8 @@
             <w:vAlign w:val="center"/>
           </w:tcPr>
           <w:p>
-            <w:pPr>
-              <w:rPr>
-                <w:lang w:val="en-US"/>
-              </w:rPr>
-            </w:pPr>
-            <w:r>
-              <w:rPr>
-                <w:lang w:val="en-US"/>
-              </w:rPr>
-              <w:t>When the active software mode is the regenerative-braking mode and (((speed &gt; SPEED_EV_MAX) &amp;&amp; (P_dem &gt;= PDEM_STOP_LOW)) || SOC &lt; SOC_EV_OUT), the software shall transition to Start mode.</w:t>
+            <w:r>
+              <w:t>When the active software mode is the regenerative-braking mode and ((speed_dkph &gt; SPEED_EV_MAX_DKPH) &amp; (p_dem_dkw &gt;= PDEM_STOP_LOW_DKW)) | (soc_q10000 &lt; SOC_EV_OUT_Q10000), the software shall transition to Start mode.</w:t>
             </w:r>
           </w:p>
         </w:tc>
@@ -14220,16 +13902,8 @@
             <w:vAlign w:val="center"/>
           </w:tcPr>
           <w:p>
-            <w:pPr>
-              <w:rPr>
-                <w:lang w:val="en-US"/>
-              </w:rPr>
-            </w:pPr>
-            <w:r>
-              <w:rPr>
-                <w:lang w:val="en-US"/>
-              </w:rPr>
-              <w:t>When the active software mode is the regenerative-braking mode and speed &lt;= SPEED_STOP &amp;&amp; P_dem &lt;= PDEM_STOP_HIGH &amp;&amp; P_dem &gt;= PDEM_STOP_LOW, the software shall transition to the standstill mode.</w:t>
+            <w:r>
+              <w:t>When the active software mode is the regenerative-braking mode and speed_dkph &lt;= SPEED_STOP_DKPH &amp;&amp; p_dem_dkw &lt;= PDEM_STOP_HIGH_DKW &amp;&amp; p_dem_dkw &gt;= PDEM_STOP_LOW_DKW, the software shall transition to the standstill mode.</w:t>
             </w:r>
           </w:p>
         </w:tc>
@@ -14469,16 +14143,8 @@
             <w:vAlign w:val="center"/>
           </w:tcPr>
           <w:p>
-            <w:pPr>
-              <w:rPr>
-                <w:lang w:val="en-US"/>
-              </w:rPr>
-            </w:pPr>
-            <w:r>
-              <w:rPr>
-                <w:lang w:val="en-US"/>
-              </w:rPr>
-              <w:t>When the active software mode is the regenerative-braking mode and P_dem &gt;= PDEM_STOP_LOW &amp;&amp; speed &gt; SPEED_STOP &amp;&amp; speed &lt;= SPEED_EV_MAX &amp;&amp; SOC &gt;= SOC_EV_OUT, the software shall transition to EV mode.</w:t>
+            <w:r>
+              <w:t>When the active software mode is the regenerative-braking mode and p_dem_dkw &gt;= PDEM_STOP_LOW_DKW &amp;&amp; speed_dkph &gt; SPEED_STOP_DKPH, the software shall transition to EV mode.</w:t>
             </w:r>
           </w:p>
         </w:tc>
@@ -14514,10 +14180,7 @@
               </w:rPr>
             </w:pPr>
             <w:r>
-              <w:rPr>
-                <w:lang w:val="en-US"/>
-              </w:rPr>
-              <w:t>Applies while the active software mode is the regenerative-braking mode, after the higher-priority engine-supported and standstill exits have been excluded.</w:t>
+              <w:t>Applies while the active software mode is the regenerative-braking mode, after the higher-priority engine-supported and standstill exits have been excluded; those failed exits already guarantee speed_dkph &lt;= SPEED_EV_MAX_DKPH and soc_q10000 &gt;= SOC_EV_OUT_Q10000 for this lower-priority EV exit.</w:t>
             </w:r>
           </w:p>
         </w:tc>
@@ -14718,16 +14381,8 @@
             <w:vAlign w:val="center"/>
           </w:tcPr>
           <w:p>
-            <w:pPr>
-              <w:rPr>
-                <w:lang w:val="en-US"/>
-              </w:rPr>
-            </w:pPr>
-            <w:r>
-              <w:rPr>
-                <w:lang w:val="en-US"/>
-              </w:rPr>
-              <w:t>When the active software mode is Start mode and wEng &gt; ENG_ON &amp;&amp; speed &gt; SPEED_REGEN &amp;&amp; P_dem &lt;= PDEM_REGEN, the software shall transition to the regenerative-braking mode.</w:t>
+            <w:r>
+              <w:t>When the active software mode is Start mode and weng_rpm &gt; ENG_ON_RPM &amp;&amp; speed_dkph &gt; SPEED_REGEN_DKPH &amp;&amp; p_dem_dkw &lt;= PDEM_REGEN_DKW, the software shall transition to the regenerative-braking mode.</w:t>
             </w:r>
           </w:p>
         </w:tc>
@@ -14968,16 +14623,8 @@
             <w:vAlign w:val="center"/>
           </w:tcPr>
           <w:p>
-            <w:pPr>
-              <w:rPr>
-                <w:lang w:val="en-US"/>
-              </w:rPr>
-            </w:pPr>
-            <w:r>
-              <w:rPr>
-                <w:lang w:val="en-US"/>
-              </w:rPr>
-              <w:t>When the active software mode is ICE mode and wEng &gt; ENG_ON &amp;&amp; speed &gt; SPEED_REGEN &amp;&amp; P_dem &lt;= PDEM_REGEN, the software shall transition to the regenerative-braking mode.</w:t>
+            <w:r>
+              <w:t>When the active software mode is ICE mode and weng_rpm &gt; ENG_ON_RPM &amp;&amp; speed_dkph &gt; SPEED_REGEN_DKPH &amp;&amp; p_dem_dkw &lt;= PDEM_REGEN_DKW, the software shall transition to the regenerative-braking mode.</w:t>
             </w:r>
           </w:p>
         </w:tc>
@@ -15217,16 +14864,8 @@
             <w:vAlign w:val="center"/>
           </w:tcPr>
           <w:p>
-            <w:pPr>
-              <w:rPr>
-                <w:lang w:val="en-US"/>
-              </w:rPr>
-            </w:pPr>
-            <w:r>
-              <w:rPr>
-                <w:lang w:val="en-US"/>
-              </w:rPr>
-              <w:t>When the active software mode is Hybrid mode and wEng &gt; ENG_ON &amp;&amp; speed &gt; SPEED_REGEN &amp;&amp; P_dem &lt;= PDEM_REGEN, the software shall transition to the regenerative-braking mode.</w:t>
+            <w:r>
+              <w:t>When the active software mode is Hybrid mode and weng_rpm &gt; ENG_ON_RPM &amp;&amp; speed_dkph &gt; SPEED_REGEN_DKPH &amp;&amp; p_dem_dkw &lt;= PDEM_REGEN_DKW, the software shall transition to the regenerative-braking mode.</w:t>
             </w:r>
           </w:p>
         </w:tc>
@@ -15466,16 +15105,8 @@
             <w:vAlign w:val="center"/>
           </w:tcPr>
           <w:p>
-            <w:pPr>
-              <w:rPr>
-                <w:lang w:val="en-US"/>
-              </w:rPr>
-            </w:pPr>
-            <w:r>
-              <w:rPr>
-                <w:lang w:val="en-US"/>
-              </w:rPr>
-              <w:t>When the active software mode is Start mode and wEng &gt; ENG_ON &amp;&amp; P_dem &lt;= PDEM_HYB_OUT &amp;&amp; P_dem &gt;= PDEM_STOP_LOW &amp;&amp; speed &gt; SPEED_STOP &amp;&amp; speed &lt;= SPEED_EV_MAX &amp;&amp; SOC &gt;= SOC_EV_IN, the software shall transition to EV mode.</w:t>
+            <w:r>
+              <w:t>When the active software mode is Start mode and weng_rpm &gt; ENG_ON_RPM &amp;&amp; p_dem_dkw &lt;= PDEM_HYB_OUT_DKW &amp;&amp; p_dem_dkw &gt;= PDEM_STOP_LOW_DKW &amp;&amp; speed_dkph &gt; SPEED_STOP_DKPH &amp;&amp; speed_dkph &lt;= SPEED_EV_MAX_DKPH &amp;&amp; soc_q10000 &gt;= SOC_EV_IN_Q10000, the software shall transition to EV mode.</w:t>
             </w:r>
           </w:p>
         </w:tc>
@@ -15714,16 +15345,8 @@
             <w:vAlign w:val="center"/>
           </w:tcPr>
           <w:p>
-            <w:pPr>
-              <w:rPr>
-                <w:lang w:val="en-US"/>
-              </w:rPr>
-            </w:pPr>
-            <w:r>
-              <w:rPr>
-                <w:lang w:val="en-US"/>
-              </w:rPr>
-              <w:t>When the active software mode is ICE mode and wEng &gt; ENG_ON &amp;&amp; P_dem &lt;= PDEM_HYB_OUT &amp;&amp; P_dem &gt;= PDEM_STOP_LOW &amp;&amp; speed &gt; SPEED_STOP &amp;&amp; speed &lt;= SPEED_EV_MAX &amp;&amp; SOC &gt;= SOC_EV_IN, the software shall transition to EV mode.</w:t>
+            <w:r>
+              <w:t>When the active software mode is ICE mode and weng_rpm &gt; ENG_ON_RPM &amp;&amp; p_dem_dkw &lt;= PDEM_HYB_OUT_DKW &amp;&amp; p_dem_dkw &gt;= PDEM_STOP_LOW_DKW &amp;&amp; speed_dkph &gt; SPEED_STOP_DKPH &amp;&amp; speed_dkph &lt;= SPEED_EV_MAX_DKPH &amp;&amp; soc_q10000 &gt;= SOC_EV_IN_Q10000, the software shall transition to EV mode.</w:t>
             </w:r>
           </w:p>
         </w:tc>
@@ -15961,16 +15584,8 @@
             <w:vAlign w:val="center"/>
           </w:tcPr>
           <w:p>
-            <w:pPr>
-              <w:rPr>
-                <w:lang w:val="en-US"/>
-              </w:rPr>
-            </w:pPr>
-            <w:r>
-              <w:rPr>
-                <w:lang w:val="en-US"/>
-              </w:rPr>
-              <w:t>When the active software mode is Hybrid mode and wEng &gt; ENG_ON &amp;&amp; P_dem &lt;= PDEM_HYB_OUT &amp;&amp; P_dem &gt;= PDEM_STOP_LOW &amp;&amp; speed &gt; SPEED_STOP &amp;&amp; speed &lt;= SPEED_EV_MAX &amp;&amp; SOC &gt;= SOC_EV_IN, the software shall transition to EV mode.</w:t>
+            <w:r>
+              <w:t>When the active software mode is Hybrid mode and weng_rpm &gt; ENG_ON_RPM &amp;&amp; p_dem_dkw &lt;= PDEM_HYB_OUT_DKW &amp;&amp; p_dem_dkw &gt;= PDEM_STOP_LOW_DKW &amp;&amp; speed_dkph &gt; SPEED_STOP_DKPH &amp;&amp; speed_dkph &lt;= SPEED_EV_MAX_DKPH &amp;&amp; soc_q10000 &gt;= SOC_EV_IN_Q10000, the software shall transition to EV mode.</w:t>
             </w:r>
           </w:p>
         </w:tc>
@@ -16208,16 +15823,8 @@
             <w:vAlign w:val="center"/>
           </w:tcPr>
           <w:p>
-            <w:pPr>
-              <w:rPr>
-                <w:lang w:val="en-US"/>
-              </w:rPr>
-            </w:pPr>
-            <w:r>
-              <w:rPr>
-                <w:lang w:val="en-US"/>
-              </w:rPr>
-              <w:t>When the active software mode is Start mode and speed &lt;= SPEED_STOP &amp;&amp; P_dem &lt;= PDEM_STOP_HIGH &amp;&amp; P_dem &gt;= PDEM_STOP_LOW, the software shall transition to the standstill mode.</w:t>
+            <w:r>
+              <w:t>When the active software mode is Start mode and speed_dkph &lt;= SPEED_STOP_DKPH &amp;&amp; p_dem_dkw &lt;= PDEM_STOP_HIGH_DKW &amp;&amp; p_dem_dkw &gt;= PDEM_STOP_LOW_DKW, the software shall transition to the standstill mode.</w:t>
             </w:r>
           </w:p>
         </w:tc>
@@ -16458,16 +16065,8 @@
             <w:vAlign w:val="center"/>
           </w:tcPr>
           <w:p>
-            <w:pPr>
-              <w:rPr>
-                <w:lang w:val="en-US"/>
-              </w:rPr>
-            </w:pPr>
-            <w:r>
-              <w:rPr>
-                <w:lang w:val="en-US"/>
-              </w:rPr>
-              <w:t>When the active software mode is ICE mode and speed &lt;= SPEED_STOP &amp;&amp; P_dem &lt;= PDEM_STOP_HIGH &amp;&amp; P_dem &gt;= PDEM_STOP_LOW, the software shall transition to the standstill mode.</w:t>
+            <w:r>
+              <w:t>When the active software mode is ICE mode and speed_dkph &lt;= SPEED_STOP_DKPH &amp;&amp; p_dem_dkw &lt;= PDEM_STOP_HIGH_DKW &amp;&amp; p_dem_dkw &gt;= PDEM_STOP_LOW_DKW, the software shall transition to the standstill mode.</w:t>
             </w:r>
           </w:p>
         </w:tc>
@@ -16707,16 +16306,8 @@
             <w:vAlign w:val="center"/>
           </w:tcPr>
           <w:p>
-            <w:pPr>
-              <w:rPr>
-                <w:lang w:val="en-US"/>
-              </w:rPr>
-            </w:pPr>
-            <w:r>
-              <w:rPr>
-                <w:lang w:val="en-US"/>
-              </w:rPr>
-              <w:t>When the active software mode is Hybrid mode and speed &lt;= SPEED_STOP &amp;&amp; P_dem &lt;= PDEM_STOP_HIGH &amp;&amp; P_dem &gt;= PDEM_STOP_LOW, the software shall transition to the standstill mode.</w:t>
+            <w:r>
+              <w:t>When the active software mode is Hybrid mode and speed_dkph &lt;= SPEED_STOP_DKPH &amp;&amp; p_dem_dkw &lt;= PDEM_STOP_HIGH_DKW &amp;&amp; p_dem_dkw &gt;= PDEM_STOP_LOW_DKW, the software shall transition to the standstill mode.</w:t>
             </w:r>
           </w:p>
         </w:tc>
@@ -16956,16 +16547,8 @@
             <w:vAlign w:val="center"/>
           </w:tcPr>
           <w:p>
-            <w:pPr>
-              <w:rPr>
-                <w:lang w:val="en-US"/>
-              </w:rPr>
-            </w:pPr>
-            <w:r>
-              <w:rPr>
-                <w:lang w:val="en-US"/>
-              </w:rPr>
-              <w:t>When the active software mode is Start mode and wEng &gt; ENG_ON &amp;&amp; SOC &gt;= SOC_MID &amp;&amp; (speed &gt; SPEED_EV_MAX || P_dem &gt;= PDEM_HYB_MID), the software shall transition to Hybrid mode.</w:t>
+            <w:r>
+              <w:t>When the active software mode is Start mode and weng_rpm &gt; ENG_ON_RPM &amp;&amp; soc_q10000 &gt;= SOC_MID_Q10000 &amp;&amp; (speed_dkph &gt; SPEED_EV_MAX_DKPH || p_dem_dkw &gt;= PDEM_HYB_MID_DKW), the software shall transition to Hybrid mode.</w:t>
             </w:r>
           </w:p>
         </w:tc>
@@ -17205,23 +16788,8 @@
             <w:vAlign w:val="center"/>
           </w:tcPr>
           <w:p>
-            <w:pPr>
-              <w:rPr>
-                <w:lang w:val="en-US"/>
-              </w:rPr>
-            </w:pPr>
-            <w:r>
-              <w:rPr>
-                <w:lang w:val="en-US"/>
-              </w:rPr>
-              <w:t xml:space="preserve">When the active software mode is Start mode and wEng &gt; ENG_ON &amp;&amp; (SOC &lt; SOC_MID || (speed &lt;= SPEED_EV_MAX </w:t>
-            </w:r>
-            <w:r>
-              <w:rPr>
-                <w:lang w:val="en-US"/>
-              </w:rPr>
-              <w:lastRenderedPageBreak/>
-              <w:t>&amp;&amp; P_dem &lt; PDEM_HYB_MID)), the software shall transition to ICE mode.</w:t>
+            <w:r>
+              <w:t>When the active software mode is Start mode and weng_rpm &gt; ENG_ON_RPM, the software shall transition to ICE mode.</w:t>
             </w:r>
           </w:p>
         </w:tc>
@@ -17359,10 +16927,7 @@
               </w:rPr>
             </w:pPr>
             <w:r>
-              <w:rPr>
-                <w:lang w:val="en-US"/>
-              </w:rPr>
-              <w:t>Implements the internal Start_mode transition to ICE mode.</w:t>
+              <w:t>Implements the internal Start_mode transition to ICE mode after the higher-priority Hybrid transition has been excluded.</w:t>
             </w:r>
           </w:p>
         </w:tc>
@@ -17462,16 +17027,8 @@
             <w:vAlign w:val="center"/>
           </w:tcPr>
           <w:p>
-            <w:pPr>
-              <w:rPr>
-                <w:lang w:val="en-US"/>
-              </w:rPr>
-            </w:pPr>
-            <w:r>
-              <w:rPr>
-                <w:lang w:val="en-US"/>
-              </w:rPr>
-              <w:t>When the active software mode is ICE mode and wEng &lt;= ENG_OFF, the software shall transition to Start mode.</w:t>
+            <w:r>
+              <w:t>When the active software mode is ICE mode and weng_rpm &lt;= ENG_OFF_RPM, the software shall transition to Start mode.</w:t>
             </w:r>
           </w:p>
         </w:tc>
@@ -17711,16 +17268,8 @@
             <w:vAlign w:val="center"/>
           </w:tcPr>
           <w:p>
-            <w:pPr>
-              <w:rPr>
-                <w:lang w:val="en-US"/>
-              </w:rPr>
-            </w:pPr>
-            <w:r>
-              <w:rPr>
-                <w:lang w:val="en-US"/>
-              </w:rPr>
-              <w:t>When the active software mode is ICE mode and P_dem &gt;= PDEM_HYB_MID &amp;&amp; SOC &gt;= SOC_MID, the software shall transition to Hybrid mode.</w:t>
+            <w:r>
+              <w:t>When the active software mode is ICE mode and p_dem_dkw &gt;= PDEM_HYB_MID_DKW &amp;&amp; soc_q10000 &gt;= SOC_MID_Q10000, the software shall transition to Hybrid mode.</w:t>
             </w:r>
           </w:p>
         </w:tc>
@@ -17960,16 +17509,8 @@
             <w:vAlign w:val="center"/>
           </w:tcPr>
           <w:p>
-            <w:pPr>
-              <w:rPr>
-                <w:lang w:val="en-US"/>
-              </w:rPr>
-            </w:pPr>
-            <w:r>
-              <w:rPr>
-                <w:lang w:val="en-US"/>
-              </w:rPr>
-              <w:t>When the active software mode is Hybrid mode and wEng &lt;= ENG_OFF, the software shall transition to Start mode.</w:t>
+            <w:r>
+              <w:t>When the active software mode is Hybrid mode and weng_rpm &lt;= ENG_OFF_RPM, the software shall transition to Start mode.</w:t>
             </w:r>
           </w:p>
         </w:tc>
@@ -18210,16 +17751,8 @@
             <w:vAlign w:val="center"/>
           </w:tcPr>
           <w:p>
-            <w:pPr>
-              <w:rPr>
-                <w:lang w:val="en-US"/>
-              </w:rPr>
-            </w:pPr>
-            <w:r>
-              <w:rPr>
-                <w:lang w:val="en-US"/>
-              </w:rPr>
-              <w:t>When the active software mode is Hybrid mode and (P_dem &lt;= PDEM_HYB_LOW || SOC &lt; SOC_LOW), the software shall transition to ICE mode.</w:t>
+            <w:r>
+              <w:t>When the active software mode is Hybrid mode and p_dem_dkw &lt;= PDEM_HYB_LOW_DKW || soc_q10000 &lt; SOC_LOW_Q10000, the software shall transition to ICE mode.</w:t>
             </w:r>
           </w:p>
         </w:tc>
@@ -21562,7 +21095,7 @@
           </w:tcPr>
           <w:p>
             <w:r>
-              <w:t>Vehicle speed (speed)</w:t>
+              <w:t>Vehicle speed (speed_dkph / model speed)</w:t>
             </w:r>
           </w:p>
         </w:tc>
@@ -21583,16 +21116,8 @@
             </w:tcMar>
           </w:tcPr>
           <w:p>
-            <w:pPr>
-              <w:rPr>
-                <w:lang w:val="en-US"/>
-              </w:rPr>
-            </w:pPr>
-            <w:r>
-              <w:rPr>
-                <w:lang w:val="en-US"/>
-              </w:rPr>
-              <w:t>Vehicle-speed input used by Control/Mode Logic to detect standstill, EV eligibility, regenerative entry, and exits from engine-supported operation.</w:t>
+            <w:r>
+              <w:t>Vehicle-speed input. The model uses km/h; production C uses speed_dkph in 0.1 km/h.</w:t>
             </w:r>
           </w:p>
         </w:tc>
@@ -21619,7 +21144,7 @@
           </w:tcPr>
           <w:p>
             <w:r>
-              <w:t>Requested power (P_dem)</w:t>
+              <w:t>Requested power (p_dem_dkw / model P_dem)</w:t>
             </w:r>
           </w:p>
         </w:tc>
@@ -21640,16 +21165,8 @@
             </w:tcMar>
           </w:tcPr>
           <w:p>
-            <w:pPr>
-              <w:rPr>
-                <w:lang w:val="en-US"/>
-              </w:rPr>
-            </w:pPr>
-            <w:r>
-              <w:rPr>
-                <w:lang w:val="en-US"/>
-              </w:rPr>
-              <w:t>Requested-power input used to distinguish propulsion demand, regenerative demand, neutral stop demand, and hybrid-entry thresholds.</w:t>
+            <w:r>
+              <w:t>Requested-power input. The model uses kW; production C uses p_dem_dkw in 0.1 kW.</w:t>
             </w:r>
           </w:p>
         </w:tc>
@@ -21675,16 +21192,8 @@
             </w:tcMar>
           </w:tcPr>
           <w:p>
-            <w:pPr>
-              <w:rPr>
-                <w:lang w:val="en-US"/>
-              </w:rPr>
-            </w:pPr>
-            <w:r>
-              <w:rPr>
-                <w:lang w:val="en-US"/>
-              </w:rPr>
-              <w:t>Battery state of charge (SOC / charge)</w:t>
+            <w:r>
+              <w:t>Battery state of charge (soc_q10000 / model charge)</w:t>
             </w:r>
           </w:p>
         </w:tc>
@@ -21705,16 +21214,8 @@
             </w:tcMar>
           </w:tcPr>
           <w:p>
-            <w:pPr>
-              <w:rPr>
-                <w:lang w:val="en-US"/>
-              </w:rPr>
-            </w:pPr>
-            <w:r>
-              <w:rPr>
-                <w:lang w:val="en-US"/>
-              </w:rPr>
-              <w:t>Battery state-of-charge input used to admit or reject EV operation and to select ICE or Hybrid behavior inside Motion_mode_ICE.</w:t>
+            <w:r>
+              <w:t>Battery state-of-charge input. The model uses 0..1; production C uses soc_q10000 in 0..10000.</w:t>
             </w:r>
           </w:p>
         </w:tc>
@@ -21740,16 +21241,8 @@
             </w:tcMar>
           </w:tcPr>
           <w:p>
-            <w:pPr>
-              <w:rPr>
-                <w:lang w:val="en-US"/>
-              </w:rPr>
-            </w:pPr>
-            <w:r>
-              <w:rPr>
-                <w:lang w:val="en-US"/>
-              </w:rPr>
-              <w:t>Engine speed (wEng / engine_speed)</w:t>
+            <w:r>
+              <w:t>Engine speed (weng_rpm / model engine_speed)</w:t>
             </w:r>
           </w:p>
         </w:tc>
@@ -21770,16 +21263,8 @@
             </w:tcMar>
           </w:tcPr>
           <w:p>
-            <w:pPr>
-              <w:rPr>
-                <w:lang w:val="en-US"/>
-              </w:rPr>
-            </w:pPr>
-            <w:r>
-              <w:rPr>
-                <w:lang w:val="en-US"/>
-              </w:rPr>
-              <w:t>Engine-speed input used for engine-on and engine-off hysteresis in Motion_mode_ICE.</w:t>
+            <w:r>
+              <w:t>Engine-speed input in rpm; production C uses weng_rpm.</w:t>
             </w:r>
           </w:p>
         </w:tc>
@@ -22799,11 +22284,8 @@
             </w:tcMar>
           </w:tcPr>
           <w:p>
-            <w:pPr>
-              <w:jc w:val="both"/>
-            </w:pPr>
-            <w:r>
-              <w:t>ENG_ON</w:t>
+            <w:r>
+              <w:t>ENG_ON_RPM</w:t>
             </w:r>
           </w:p>
         </w:tc>
@@ -22860,11 +22342,8 @@
             </w:tcMar>
           </w:tcPr>
           <w:p>
-            <w:pPr>
-              <w:jc w:val="both"/>
-            </w:pPr>
-            <w:r>
-              <w:t>ENG_OFF</w:t>
+            <w:r>
+              <w:t>ENG_OFF_RPM</w:t>
             </w:r>
           </w:p>
         </w:tc>
@@ -22921,11 +22400,8 @@
             </w:tcMar>
           </w:tcPr>
           <w:p>
-            <w:pPr>
-              <w:jc w:val="both"/>
-            </w:pPr>
-            <w:r>
-              <w:t>SPEED_STOP</w:t>
+            <w:r>
+              <w:t>SPEED_STOP_DKPH</w:t>
             </w:r>
           </w:p>
         </w:tc>
@@ -22982,11 +22458,8 @@
             </w:tcMar>
           </w:tcPr>
           <w:p>
-            <w:pPr>
-              <w:jc w:val="both"/>
-            </w:pPr>
-            <w:r>
-              <w:t>SPEED_REGEN</w:t>
+            <w:r>
+              <w:t>SPEED_REGEN_DKPH</w:t>
             </w:r>
           </w:p>
         </w:tc>
@@ -23043,11 +22516,8 @@
             </w:tcMar>
           </w:tcPr>
           <w:p>
-            <w:pPr>
-              <w:jc w:val="both"/>
-            </w:pPr>
-            <w:r>
-              <w:t>SPEED_EV_MAX</w:t>
+            <w:r>
+              <w:t>SPEED_EV_MAX_DKPH</w:t>
             </w:r>
           </w:p>
         </w:tc>
@@ -23104,11 +22574,8 @@
             </w:tcMar>
           </w:tcPr>
           <w:p>
-            <w:pPr>
-              <w:jc w:val="both"/>
-            </w:pPr>
-            <w:r>
-              <w:t>PDEM_REGEN</w:t>
+            <w:r>
+              <w:t>PDEM_REGEN_DKW</w:t>
             </w:r>
           </w:p>
         </w:tc>
@@ -23165,11 +22632,8 @@
             </w:tcMar>
           </w:tcPr>
           <w:p>
-            <w:pPr>
-              <w:jc w:val="both"/>
-            </w:pPr>
-            <w:r>
-              <w:t>PDEM_HYB_IN</w:t>
+            <w:r>
+              <w:t>PDEM_HYB_IN_DKW</w:t>
             </w:r>
           </w:p>
         </w:tc>
@@ -23226,11 +22690,8 @@
             </w:tcMar>
           </w:tcPr>
           <w:p>
-            <w:pPr>
-              <w:jc w:val="both"/>
-            </w:pPr>
-            <w:r>
-              <w:t>PDEM_HYB_OUT</w:t>
+            <w:r>
+              <w:t>PDEM_HYB_OUT_DKW</w:t>
             </w:r>
           </w:p>
         </w:tc>
@@ -23287,11 +22748,8 @@
             </w:tcMar>
           </w:tcPr>
           <w:p>
-            <w:pPr>
-              <w:jc w:val="both"/>
-            </w:pPr>
-            <w:r>
-              <w:t>PDEM_HYB_MID</w:t>
+            <w:r>
+              <w:t>PDEM_HYB_MID_DKW</w:t>
             </w:r>
           </w:p>
         </w:tc>
@@ -23348,12 +22806,8 @@
             </w:tcMar>
           </w:tcPr>
           <w:p>
-            <w:pPr>
-              <w:jc w:val="both"/>
-            </w:pPr>
-            <w:r>
-              <w:lastRenderedPageBreak/>
-              <w:t>PDEM_HYB_LOW</w:t>
+            <w:r>
+              <w:t>PDEM_HYB_LOW_DKW</w:t>
             </w:r>
           </w:p>
         </w:tc>
@@ -23410,11 +22864,8 @@
             </w:tcMar>
           </w:tcPr>
           <w:p>
-            <w:pPr>
-              <w:jc w:val="both"/>
-            </w:pPr>
-            <w:r>
-              <w:t>SOC_EV_IN</w:t>
+            <w:r>
+              <w:t>SOC_EV_IN_Q10000</w:t>
             </w:r>
           </w:p>
         </w:tc>
@@ -23471,11 +22922,8 @@
             </w:tcMar>
           </w:tcPr>
           <w:p>
-            <w:pPr>
-              <w:jc w:val="both"/>
-            </w:pPr>
-            <w:r>
-              <w:t>SOC_EV_OUT</w:t>
+            <w:r>
+              <w:t>SOC_EV_OUT_Q10000</w:t>
             </w:r>
           </w:p>
         </w:tc>
@@ -23532,11 +22980,8 @@
             </w:tcMar>
           </w:tcPr>
           <w:p>
-            <w:pPr>
-              <w:jc w:val="both"/>
-            </w:pPr>
-            <w:r>
-              <w:t>SOC_MID</w:t>
+            <w:r>
+              <w:t>SOC_MID_Q10000</w:t>
             </w:r>
           </w:p>
         </w:tc>
@@ -23593,11 +23038,8 @@
             </w:tcMar>
           </w:tcPr>
           <w:p>
-            <w:pPr>
-              <w:jc w:val="both"/>
-            </w:pPr>
-            <w:r>
-              <w:t>SOC_LOW</w:t>
+            <w:r>
+              <w:t>SOC_LOW_Q10000</w:t>
             </w:r>
           </w:p>
         </w:tc>

</xml_diff>